<commit_message>
Cambios en los manuales
modificacion en los manuales
</commit_message>
<xml_diff>
--- a/Documentación del Sistema/Documentación/Manuales/Manual de usuario Modulo 1 Y 6.docx
+++ b/Documentación del Sistema/Documentación/Manuales/Manual de usuario Modulo 1 Y 6.docx
@@ -331,21 +331,7 @@
           <w:szCs w:val="24"/>
         </w:rPr>
         <w:fldChar w:fldCharType="begin"/>
-      </w:r>
-      <w:r>
-        <w:rPr>
-          <w:rFonts w:ascii="Times New Roman" w:hAnsi="Times New Roman" w:cs="Times New Roman"/>
-          <w:sz w:val="24"/>
-          <w:szCs w:val="24"/>
-        </w:rPr>
         <w:instrText xml:space="preserve"> XE "Cliente" </w:instrText>
-      </w:r>
-      <w:r>
-        <w:rPr>
-          <w:rFonts w:ascii="Times New Roman" w:hAnsi="Times New Roman" w:cs="Times New Roman"/>
-          <w:sz w:val="24"/>
-          <w:szCs w:val="24"/>
-        </w:rPr>
         <w:fldChar w:fldCharType="end"/>
       </w:r>
     </w:p>
@@ -561,21 +547,7 @@
               <w:szCs w:val="24"/>
             </w:rPr>
             <w:fldChar w:fldCharType="begin"/>
-          </w:r>
-          <w:r>
-            <w:rPr>
-              <w:rFonts w:ascii="Times New Roman" w:hAnsi="Times New Roman" w:cs="Times New Roman"/>
-              <w:sz w:val="24"/>
-              <w:szCs w:val="24"/>
-            </w:rPr>
             <w:instrText xml:space="preserve"> TOC \o "1-3" \h \z \u </w:instrText>
-          </w:r>
-          <w:r>
-            <w:rPr>
-              <w:rFonts w:ascii="Times New Roman" w:hAnsi="Times New Roman" w:cs="Times New Roman"/>
-              <w:sz w:val="24"/>
-              <w:szCs w:val="24"/>
-            </w:rPr>
             <w:fldChar w:fldCharType="separate"/>
           </w:r>
           <w:hyperlink w:anchor="_Toc240627289" w:history="1">
@@ -593,46 +565,10 @@
                 <w:webHidden/>
               </w:rPr>
               <w:tab/>
-            </w:r>
-            <w:r>
-              <w:rPr>
-                <w:noProof/>
-                <w:webHidden/>
-              </w:rPr>
               <w:fldChar w:fldCharType="begin"/>
-            </w:r>
-            <w:r>
-              <w:rPr>
-                <w:noProof/>
-                <w:webHidden/>
-              </w:rPr>
               <w:instrText xml:space="preserve"> PAGEREF _Toc240627289 \h </w:instrText>
-            </w:r>
-            <w:r>
-              <w:rPr>
-                <w:noProof/>
-                <w:webHidden/>
-              </w:rPr>
-            </w:r>
-            <w:r>
-              <w:rPr>
-                <w:noProof/>
-                <w:webHidden/>
-              </w:rPr>
               <w:fldChar w:fldCharType="separate"/>
-            </w:r>
-            <w:r>
-              <w:rPr>
-                <w:noProof/>
-                <w:webHidden/>
-              </w:rPr>
               <w:t>3</w:t>
-            </w:r>
-            <w:r>
-              <w:rPr>
-                <w:noProof/>
-                <w:webHidden/>
-              </w:rPr>
               <w:fldChar w:fldCharType="end"/>
             </w:r>
           </w:hyperlink>
@@ -667,46 +603,10 @@
                 <w:webHidden/>
               </w:rPr>
               <w:tab/>
-            </w:r>
-            <w:r>
-              <w:rPr>
-                <w:noProof/>
-                <w:webHidden/>
-              </w:rPr>
               <w:fldChar w:fldCharType="begin"/>
-            </w:r>
-            <w:r>
-              <w:rPr>
-                <w:noProof/>
-                <w:webHidden/>
-              </w:rPr>
               <w:instrText xml:space="preserve"> PAGEREF _Toc240627290 \h </w:instrText>
-            </w:r>
-            <w:r>
-              <w:rPr>
-                <w:noProof/>
-                <w:webHidden/>
-              </w:rPr>
-            </w:r>
-            <w:r>
-              <w:rPr>
-                <w:noProof/>
-                <w:webHidden/>
-              </w:rPr>
               <w:fldChar w:fldCharType="separate"/>
-            </w:r>
-            <w:r>
-              <w:rPr>
-                <w:noProof/>
-                <w:webHidden/>
-              </w:rPr>
               <w:t>3</w:t>
-            </w:r>
-            <w:r>
-              <w:rPr>
-                <w:noProof/>
-                <w:webHidden/>
-              </w:rPr>
               <w:fldChar w:fldCharType="end"/>
             </w:r>
           </w:hyperlink>
@@ -741,46 +641,10 @@
                 <w:webHidden/>
               </w:rPr>
               <w:tab/>
-            </w:r>
-            <w:r>
-              <w:rPr>
-                <w:noProof/>
-                <w:webHidden/>
-              </w:rPr>
               <w:fldChar w:fldCharType="begin"/>
-            </w:r>
-            <w:r>
-              <w:rPr>
-                <w:noProof/>
-                <w:webHidden/>
-              </w:rPr>
               <w:instrText xml:space="preserve"> PAGEREF _Toc240627291 \h </w:instrText>
-            </w:r>
-            <w:r>
-              <w:rPr>
-                <w:noProof/>
-                <w:webHidden/>
-              </w:rPr>
-            </w:r>
-            <w:r>
-              <w:rPr>
-                <w:noProof/>
-                <w:webHidden/>
-              </w:rPr>
               <w:fldChar w:fldCharType="separate"/>
-            </w:r>
-            <w:r>
-              <w:rPr>
-                <w:noProof/>
-                <w:webHidden/>
-              </w:rPr>
               <w:t>3</w:t>
-            </w:r>
-            <w:r>
-              <w:rPr>
-                <w:noProof/>
-                <w:webHidden/>
-              </w:rPr>
               <w:fldChar w:fldCharType="end"/>
             </w:r>
           </w:hyperlink>
@@ -815,46 +679,10 @@
                 <w:webHidden/>
               </w:rPr>
               <w:tab/>
-            </w:r>
-            <w:r>
-              <w:rPr>
-                <w:noProof/>
-                <w:webHidden/>
-              </w:rPr>
               <w:fldChar w:fldCharType="begin"/>
-            </w:r>
-            <w:r>
-              <w:rPr>
-                <w:noProof/>
-                <w:webHidden/>
-              </w:rPr>
               <w:instrText xml:space="preserve"> PAGEREF _Toc240627292 \h </w:instrText>
-            </w:r>
-            <w:r>
-              <w:rPr>
-                <w:noProof/>
-                <w:webHidden/>
-              </w:rPr>
-            </w:r>
-            <w:r>
-              <w:rPr>
-                <w:noProof/>
-                <w:webHidden/>
-              </w:rPr>
               <w:fldChar w:fldCharType="separate"/>
-            </w:r>
-            <w:r>
-              <w:rPr>
-                <w:noProof/>
-                <w:webHidden/>
-              </w:rPr>
               <w:t>4</w:t>
-            </w:r>
-            <w:r>
-              <w:rPr>
-                <w:noProof/>
-                <w:webHidden/>
-              </w:rPr>
               <w:fldChar w:fldCharType="end"/>
             </w:r>
           </w:hyperlink>
@@ -889,46 +717,48 @@
                 <w:webHidden/>
               </w:rPr>
               <w:tab/>
+              <w:fldChar w:fldCharType="begin"/>
+              <w:instrText xml:space="preserve"> PAGEREF _Toc240627293 \h </w:instrText>
+              <w:fldChar w:fldCharType="separate"/>
+              <w:t>4</w:t>
+              <w:fldChar w:fldCharType="end"/>
+            </w:r>
+          </w:hyperlink>
+        </w:p>
+        <w:p>
+          <w:pPr>
+            <w:pStyle w:val="TDC2"/>
+            <w:tabs>
+              <w:tab w:val="right" w:leader="dot" w:pos="8778"/>
+            </w:tabs>
+            <w:rPr>
+              <w:noProof/>
+              <w:kern w:val="2"/>
+              <w:sz w:val="24"/>
+              <w:szCs w:val="24"/>
+              <w:lang w:val="es-AR" w:eastAsia="es-AR"/>
+              <w14:ligatures w14:val="standardContextual"/>
+            </w:rPr>
+          </w:pPr>
+          <w:hyperlink w:anchor="_Toc900000001" w:history="1">
+            <w:r>
+              <w:rPr>
+                <w:rStyle w:val="Hipervnculo"/>
+                <w:rFonts w:ascii="Times New Roman" w:hAnsi="Times New Roman" w:cs="Times New Roman"/>
+                <w:noProof/>
+              </w:rPr>
+              <w:t>3.1 Indicadores principales</w:t>
             </w:r>
             <w:r>
               <w:rPr>
                 <w:noProof/>
                 <w:webHidden/>
               </w:rPr>
+              <w:tab/>
               <w:fldChar w:fldCharType="begin"/>
-            </w:r>
-            <w:r>
-              <w:rPr>
-                <w:noProof/>
-                <w:webHidden/>
-              </w:rPr>
-              <w:instrText xml:space="preserve"> PAGEREF _Toc240627293 \h </w:instrText>
-            </w:r>
-            <w:r>
-              <w:rPr>
-                <w:noProof/>
-                <w:webHidden/>
-              </w:rPr>
-            </w:r>
-            <w:r>
-              <w:rPr>
-                <w:noProof/>
-                <w:webHidden/>
-              </w:rPr>
+              <w:instrText xml:space="preserve"> PAGEREF _Toc900000001 \h </w:instrText>
               <w:fldChar w:fldCharType="separate"/>
-            </w:r>
-            <w:r>
-              <w:rPr>
-                <w:noProof/>
-                <w:webHidden/>
-              </w:rPr>
               <w:t>4</w:t>
-            </w:r>
-            <w:r>
-              <w:rPr>
-                <w:noProof/>
-                <w:webHidden/>
-              </w:rPr>
               <w:fldChar w:fldCharType="end"/>
             </w:r>
           </w:hyperlink>
@@ -963,46 +793,10 @@
                 <w:webHidden/>
               </w:rPr>
               <w:tab/>
-            </w:r>
-            <w:r>
-              <w:rPr>
-                <w:noProof/>
-                <w:webHidden/>
-              </w:rPr>
               <w:fldChar w:fldCharType="begin"/>
-            </w:r>
-            <w:r>
-              <w:rPr>
-                <w:noProof/>
-                <w:webHidden/>
-              </w:rPr>
               <w:instrText xml:space="preserve"> PAGEREF _Toc240627294 \h </w:instrText>
-            </w:r>
-            <w:r>
-              <w:rPr>
-                <w:noProof/>
-                <w:webHidden/>
-              </w:rPr>
-            </w:r>
-            <w:r>
-              <w:rPr>
-                <w:noProof/>
-                <w:webHidden/>
-              </w:rPr>
               <w:fldChar w:fldCharType="separate"/>
-            </w:r>
-            <w:r>
-              <w:rPr>
-                <w:noProof/>
-                <w:webHidden/>
-              </w:rPr>
               <w:t>5</w:t>
-            </w:r>
-            <w:r>
-              <w:rPr>
-                <w:noProof/>
-                <w:webHidden/>
-              </w:rPr>
               <w:fldChar w:fldCharType="end"/>
             </w:r>
           </w:hyperlink>
@@ -1037,46 +831,10 @@
                 <w:webHidden/>
               </w:rPr>
               <w:tab/>
-            </w:r>
-            <w:r>
-              <w:rPr>
-                <w:noProof/>
-                <w:webHidden/>
-              </w:rPr>
               <w:fldChar w:fldCharType="begin"/>
-            </w:r>
-            <w:r>
-              <w:rPr>
-                <w:noProof/>
-                <w:webHidden/>
-              </w:rPr>
               <w:instrText xml:space="preserve"> PAGEREF _Toc240627295 \h </w:instrText>
-            </w:r>
-            <w:r>
-              <w:rPr>
-                <w:noProof/>
-                <w:webHidden/>
-              </w:rPr>
-            </w:r>
-            <w:r>
-              <w:rPr>
-                <w:noProof/>
-                <w:webHidden/>
-              </w:rPr>
               <w:fldChar w:fldCharType="separate"/>
-            </w:r>
-            <w:r>
-              <w:rPr>
-                <w:noProof/>
-                <w:webHidden/>
-              </w:rPr>
               <w:t>5</w:t>
-            </w:r>
-            <w:r>
-              <w:rPr>
-                <w:noProof/>
-                <w:webHidden/>
-              </w:rPr>
               <w:fldChar w:fldCharType="end"/>
             </w:r>
           </w:hyperlink>
@@ -1111,46 +869,10 @@
                 <w:webHidden/>
               </w:rPr>
               <w:tab/>
-            </w:r>
-            <w:r>
-              <w:rPr>
-                <w:noProof/>
-                <w:webHidden/>
-              </w:rPr>
               <w:fldChar w:fldCharType="begin"/>
-            </w:r>
-            <w:r>
-              <w:rPr>
-                <w:noProof/>
-                <w:webHidden/>
-              </w:rPr>
               <w:instrText xml:space="preserve"> PAGEREF _Toc240627296 \h </w:instrText>
-            </w:r>
-            <w:r>
-              <w:rPr>
-                <w:noProof/>
-                <w:webHidden/>
-              </w:rPr>
-            </w:r>
-            <w:r>
-              <w:rPr>
-                <w:noProof/>
-                <w:webHidden/>
-              </w:rPr>
               <w:fldChar w:fldCharType="separate"/>
-            </w:r>
-            <w:r>
-              <w:rPr>
-                <w:noProof/>
-                <w:webHidden/>
-              </w:rPr>
               <w:t>5</w:t>
-            </w:r>
-            <w:r>
-              <w:rPr>
-                <w:noProof/>
-                <w:webHidden/>
-              </w:rPr>
               <w:fldChar w:fldCharType="end"/>
             </w:r>
           </w:hyperlink>
@@ -1185,46 +907,10 @@
                 <w:webHidden/>
               </w:rPr>
               <w:tab/>
-            </w:r>
-            <w:r>
-              <w:rPr>
-                <w:noProof/>
-                <w:webHidden/>
-              </w:rPr>
               <w:fldChar w:fldCharType="begin"/>
-            </w:r>
-            <w:r>
-              <w:rPr>
-                <w:noProof/>
-                <w:webHidden/>
-              </w:rPr>
               <w:instrText xml:space="preserve"> PAGEREF _Toc240627297 \h </w:instrText>
-            </w:r>
-            <w:r>
-              <w:rPr>
-                <w:noProof/>
-                <w:webHidden/>
-              </w:rPr>
-            </w:r>
-            <w:r>
-              <w:rPr>
-                <w:noProof/>
-                <w:webHidden/>
-              </w:rPr>
               <w:fldChar w:fldCharType="separate"/>
-            </w:r>
-            <w:r>
-              <w:rPr>
-                <w:noProof/>
-                <w:webHidden/>
-              </w:rPr>
               <w:t>5</w:t>
-            </w:r>
-            <w:r>
-              <w:rPr>
-                <w:noProof/>
-                <w:webHidden/>
-              </w:rPr>
               <w:fldChar w:fldCharType="end"/>
             </w:r>
           </w:hyperlink>
@@ -1259,46 +945,10 @@
                 <w:webHidden/>
               </w:rPr>
               <w:tab/>
-            </w:r>
-            <w:r>
-              <w:rPr>
-                <w:noProof/>
-                <w:webHidden/>
-              </w:rPr>
               <w:fldChar w:fldCharType="begin"/>
-            </w:r>
-            <w:r>
-              <w:rPr>
-                <w:noProof/>
-                <w:webHidden/>
-              </w:rPr>
               <w:instrText xml:space="preserve"> PAGEREF _Toc240627298 \h </w:instrText>
-            </w:r>
-            <w:r>
-              <w:rPr>
-                <w:noProof/>
-                <w:webHidden/>
-              </w:rPr>
-            </w:r>
-            <w:r>
-              <w:rPr>
-                <w:noProof/>
-                <w:webHidden/>
-              </w:rPr>
               <w:fldChar w:fldCharType="separate"/>
-            </w:r>
-            <w:r>
-              <w:rPr>
-                <w:noProof/>
-                <w:webHidden/>
-              </w:rPr>
               <w:t>6</w:t>
-            </w:r>
-            <w:r>
-              <w:rPr>
-                <w:noProof/>
-                <w:webHidden/>
-              </w:rPr>
               <w:fldChar w:fldCharType="end"/>
             </w:r>
           </w:hyperlink>
@@ -1333,46 +983,10 @@
                 <w:webHidden/>
               </w:rPr>
               <w:tab/>
-            </w:r>
-            <w:r>
-              <w:rPr>
-                <w:noProof/>
-                <w:webHidden/>
-              </w:rPr>
               <w:fldChar w:fldCharType="begin"/>
-            </w:r>
-            <w:r>
-              <w:rPr>
-                <w:noProof/>
-                <w:webHidden/>
-              </w:rPr>
               <w:instrText xml:space="preserve"> PAGEREF _Toc240627299 \h </w:instrText>
-            </w:r>
-            <w:r>
-              <w:rPr>
-                <w:noProof/>
-                <w:webHidden/>
-              </w:rPr>
-            </w:r>
-            <w:r>
-              <w:rPr>
-                <w:noProof/>
-                <w:webHidden/>
-              </w:rPr>
               <w:fldChar w:fldCharType="separate"/>
-            </w:r>
-            <w:r>
-              <w:rPr>
-                <w:noProof/>
-                <w:webHidden/>
-              </w:rPr>
               <w:t>6</w:t>
-            </w:r>
-            <w:r>
-              <w:rPr>
-                <w:noProof/>
-                <w:webHidden/>
-              </w:rPr>
               <w:fldChar w:fldCharType="end"/>
             </w:r>
           </w:hyperlink>
@@ -1407,46 +1021,10 @@
                 <w:webHidden/>
               </w:rPr>
               <w:tab/>
-            </w:r>
-            <w:r>
-              <w:rPr>
-                <w:noProof/>
-                <w:webHidden/>
-              </w:rPr>
               <w:fldChar w:fldCharType="begin"/>
-            </w:r>
-            <w:r>
-              <w:rPr>
-                <w:noProof/>
-                <w:webHidden/>
-              </w:rPr>
               <w:instrText xml:space="preserve"> PAGEREF _Toc240627300 \h </w:instrText>
-            </w:r>
-            <w:r>
-              <w:rPr>
-                <w:noProof/>
-                <w:webHidden/>
-              </w:rPr>
-            </w:r>
-            <w:r>
-              <w:rPr>
-                <w:noProof/>
-                <w:webHidden/>
-              </w:rPr>
               <w:fldChar w:fldCharType="separate"/>
-            </w:r>
-            <w:r>
-              <w:rPr>
-                <w:noProof/>
-                <w:webHidden/>
-              </w:rPr>
               <w:t>8</w:t>
-            </w:r>
-            <w:r>
-              <w:rPr>
-                <w:noProof/>
-                <w:webHidden/>
-              </w:rPr>
               <w:fldChar w:fldCharType="end"/>
             </w:r>
           </w:hyperlink>
@@ -1481,46 +1059,10 @@
                 <w:webHidden/>
               </w:rPr>
               <w:tab/>
-            </w:r>
-            <w:r>
-              <w:rPr>
-                <w:noProof/>
-                <w:webHidden/>
-              </w:rPr>
               <w:fldChar w:fldCharType="begin"/>
-            </w:r>
-            <w:r>
-              <w:rPr>
-                <w:noProof/>
-                <w:webHidden/>
-              </w:rPr>
               <w:instrText xml:space="preserve"> PAGEREF _Toc240627301 \h </w:instrText>
-            </w:r>
-            <w:r>
-              <w:rPr>
-                <w:noProof/>
-                <w:webHidden/>
-              </w:rPr>
-            </w:r>
-            <w:r>
-              <w:rPr>
-                <w:noProof/>
-                <w:webHidden/>
-              </w:rPr>
               <w:fldChar w:fldCharType="separate"/>
-            </w:r>
-            <w:r>
-              <w:rPr>
-                <w:noProof/>
-                <w:webHidden/>
-              </w:rPr>
               <w:t>8</w:t>
-            </w:r>
-            <w:r>
-              <w:rPr>
-                <w:noProof/>
-                <w:webHidden/>
-              </w:rPr>
               <w:fldChar w:fldCharType="end"/>
             </w:r>
           </w:hyperlink>
@@ -1555,46 +1097,10 @@
                 <w:webHidden/>
               </w:rPr>
               <w:tab/>
-            </w:r>
-            <w:r>
-              <w:rPr>
-                <w:noProof/>
-                <w:webHidden/>
-              </w:rPr>
               <w:fldChar w:fldCharType="begin"/>
-            </w:r>
-            <w:r>
-              <w:rPr>
-                <w:noProof/>
-                <w:webHidden/>
-              </w:rPr>
               <w:instrText xml:space="preserve"> PAGEREF _Toc240627302 \h </w:instrText>
-            </w:r>
-            <w:r>
-              <w:rPr>
-                <w:noProof/>
-                <w:webHidden/>
-              </w:rPr>
-            </w:r>
-            <w:r>
-              <w:rPr>
-                <w:noProof/>
-                <w:webHidden/>
-              </w:rPr>
               <w:fldChar w:fldCharType="separate"/>
-            </w:r>
-            <w:r>
-              <w:rPr>
-                <w:noProof/>
-                <w:webHidden/>
-              </w:rPr>
               <w:t>9</w:t>
-            </w:r>
-            <w:r>
-              <w:rPr>
-                <w:noProof/>
-                <w:webHidden/>
-              </w:rPr>
               <w:fldChar w:fldCharType="end"/>
             </w:r>
           </w:hyperlink>
@@ -1629,46 +1135,10 @@
                 <w:webHidden/>
               </w:rPr>
               <w:tab/>
-            </w:r>
-            <w:r>
-              <w:rPr>
-                <w:noProof/>
-                <w:webHidden/>
-              </w:rPr>
               <w:fldChar w:fldCharType="begin"/>
-            </w:r>
-            <w:r>
-              <w:rPr>
-                <w:noProof/>
-                <w:webHidden/>
-              </w:rPr>
               <w:instrText xml:space="preserve"> PAGEREF _Toc240627303 \h </w:instrText>
-            </w:r>
-            <w:r>
-              <w:rPr>
-                <w:noProof/>
-                <w:webHidden/>
-              </w:rPr>
-            </w:r>
-            <w:r>
-              <w:rPr>
-                <w:noProof/>
-                <w:webHidden/>
-              </w:rPr>
               <w:fldChar w:fldCharType="separate"/>
-            </w:r>
-            <w:r>
-              <w:rPr>
-                <w:noProof/>
-                <w:webHidden/>
-              </w:rPr>
               <w:t>10</w:t>
-            </w:r>
-            <w:r>
-              <w:rPr>
-                <w:noProof/>
-                <w:webHidden/>
-              </w:rPr>
               <w:fldChar w:fldCharType="end"/>
             </w:r>
           </w:hyperlink>
@@ -1703,46 +1173,10 @@
                 <w:webHidden/>
               </w:rPr>
               <w:tab/>
-            </w:r>
-            <w:r>
-              <w:rPr>
-                <w:noProof/>
-                <w:webHidden/>
-              </w:rPr>
               <w:fldChar w:fldCharType="begin"/>
-            </w:r>
-            <w:r>
-              <w:rPr>
-                <w:noProof/>
-                <w:webHidden/>
-              </w:rPr>
               <w:instrText xml:space="preserve"> PAGEREF _Toc240627304 \h </w:instrText>
-            </w:r>
-            <w:r>
-              <w:rPr>
-                <w:noProof/>
-                <w:webHidden/>
-              </w:rPr>
-            </w:r>
-            <w:r>
-              <w:rPr>
-                <w:noProof/>
-                <w:webHidden/>
-              </w:rPr>
               <w:fldChar w:fldCharType="separate"/>
-            </w:r>
-            <w:r>
-              <w:rPr>
-                <w:noProof/>
-                <w:webHidden/>
-              </w:rPr>
               <w:t>12</w:t>
-            </w:r>
-            <w:r>
-              <w:rPr>
-                <w:noProof/>
-                <w:webHidden/>
-              </w:rPr>
               <w:fldChar w:fldCharType="end"/>
             </w:r>
           </w:hyperlink>
@@ -1777,46 +1211,10 @@
                 <w:webHidden/>
               </w:rPr>
               <w:tab/>
-            </w:r>
-            <w:r>
-              <w:rPr>
-                <w:noProof/>
-                <w:webHidden/>
-              </w:rPr>
               <w:fldChar w:fldCharType="begin"/>
-            </w:r>
-            <w:r>
-              <w:rPr>
-                <w:noProof/>
-                <w:webHidden/>
-              </w:rPr>
               <w:instrText xml:space="preserve"> PAGEREF _Toc240627305 \h </w:instrText>
-            </w:r>
-            <w:r>
-              <w:rPr>
-                <w:noProof/>
-                <w:webHidden/>
-              </w:rPr>
-            </w:r>
-            <w:r>
-              <w:rPr>
-                <w:noProof/>
-                <w:webHidden/>
-              </w:rPr>
               <w:fldChar w:fldCharType="separate"/>
-            </w:r>
-            <w:r>
-              <w:rPr>
-                <w:noProof/>
-                <w:webHidden/>
-              </w:rPr>
               <w:t>13</w:t>
-            </w:r>
-            <w:r>
-              <w:rPr>
-                <w:noProof/>
-                <w:webHidden/>
-              </w:rPr>
               <w:fldChar w:fldCharType="end"/>
             </w:r>
           </w:hyperlink>
@@ -1851,46 +1249,10 @@
                 <w:webHidden/>
               </w:rPr>
               <w:tab/>
-            </w:r>
-            <w:r>
-              <w:rPr>
-                <w:noProof/>
-                <w:webHidden/>
-              </w:rPr>
               <w:fldChar w:fldCharType="begin"/>
-            </w:r>
-            <w:r>
-              <w:rPr>
-                <w:noProof/>
-                <w:webHidden/>
-              </w:rPr>
               <w:instrText xml:space="preserve"> PAGEREF _Toc240627306 \h </w:instrText>
-            </w:r>
-            <w:r>
-              <w:rPr>
-                <w:noProof/>
-                <w:webHidden/>
-              </w:rPr>
-            </w:r>
-            <w:r>
-              <w:rPr>
-                <w:noProof/>
-                <w:webHidden/>
-              </w:rPr>
               <w:fldChar w:fldCharType="separate"/>
-            </w:r>
-            <w:r>
-              <w:rPr>
-                <w:noProof/>
-                <w:webHidden/>
-              </w:rPr>
               <w:t>15</w:t>
-            </w:r>
-            <w:r>
-              <w:rPr>
-                <w:noProof/>
-                <w:webHidden/>
-              </w:rPr>
               <w:fldChar w:fldCharType="end"/>
             </w:r>
           </w:hyperlink>
@@ -1925,46 +1287,10 @@
                 <w:webHidden/>
               </w:rPr>
               <w:tab/>
-            </w:r>
-            <w:r>
-              <w:rPr>
-                <w:noProof/>
-                <w:webHidden/>
-              </w:rPr>
               <w:fldChar w:fldCharType="begin"/>
-            </w:r>
-            <w:r>
-              <w:rPr>
-                <w:noProof/>
-                <w:webHidden/>
-              </w:rPr>
               <w:instrText xml:space="preserve"> PAGEREF _Toc240627307 \h </w:instrText>
-            </w:r>
-            <w:r>
-              <w:rPr>
-                <w:noProof/>
-                <w:webHidden/>
-              </w:rPr>
-            </w:r>
-            <w:r>
-              <w:rPr>
-                <w:noProof/>
-                <w:webHidden/>
-              </w:rPr>
               <w:fldChar w:fldCharType="separate"/>
-            </w:r>
-            <w:r>
-              <w:rPr>
-                <w:noProof/>
-                <w:webHidden/>
-              </w:rPr>
               <w:t>15</w:t>
-            </w:r>
-            <w:r>
-              <w:rPr>
-                <w:noProof/>
-                <w:webHidden/>
-              </w:rPr>
               <w:fldChar w:fldCharType="end"/>
             </w:r>
           </w:hyperlink>
@@ -1999,46 +1325,10 @@
                 <w:webHidden/>
               </w:rPr>
               <w:tab/>
-            </w:r>
-            <w:r>
-              <w:rPr>
-                <w:noProof/>
-                <w:webHidden/>
-              </w:rPr>
               <w:fldChar w:fldCharType="begin"/>
-            </w:r>
-            <w:r>
-              <w:rPr>
-                <w:noProof/>
-                <w:webHidden/>
-              </w:rPr>
               <w:instrText xml:space="preserve"> PAGEREF _Toc240627308 \h </w:instrText>
-            </w:r>
-            <w:r>
-              <w:rPr>
-                <w:noProof/>
-                <w:webHidden/>
-              </w:rPr>
-            </w:r>
-            <w:r>
-              <w:rPr>
-                <w:noProof/>
-                <w:webHidden/>
-              </w:rPr>
               <w:fldChar w:fldCharType="separate"/>
-            </w:r>
-            <w:r>
-              <w:rPr>
-                <w:noProof/>
-                <w:webHidden/>
-              </w:rPr>
               <w:t>16</w:t>
-            </w:r>
-            <w:r>
-              <w:rPr>
-                <w:noProof/>
-                <w:webHidden/>
-              </w:rPr>
               <w:fldChar w:fldCharType="end"/>
             </w:r>
           </w:hyperlink>
@@ -2073,46 +1363,10 @@
                 <w:webHidden/>
               </w:rPr>
               <w:tab/>
-            </w:r>
-            <w:r>
-              <w:rPr>
-                <w:noProof/>
-                <w:webHidden/>
-              </w:rPr>
               <w:fldChar w:fldCharType="begin"/>
-            </w:r>
-            <w:r>
-              <w:rPr>
-                <w:noProof/>
-                <w:webHidden/>
-              </w:rPr>
               <w:instrText xml:space="preserve"> PAGEREF _Toc240627309 \h </w:instrText>
-            </w:r>
-            <w:r>
-              <w:rPr>
-                <w:noProof/>
-                <w:webHidden/>
-              </w:rPr>
-            </w:r>
-            <w:r>
-              <w:rPr>
-                <w:noProof/>
-                <w:webHidden/>
-              </w:rPr>
               <w:fldChar w:fldCharType="separate"/>
-            </w:r>
-            <w:r>
-              <w:rPr>
-                <w:noProof/>
-                <w:webHidden/>
-              </w:rPr>
               <w:t>17</w:t>
-            </w:r>
-            <w:r>
-              <w:rPr>
-                <w:noProof/>
-                <w:webHidden/>
-              </w:rPr>
               <w:fldChar w:fldCharType="end"/>
             </w:r>
           </w:hyperlink>
@@ -2147,46 +1401,10 @@
                 <w:webHidden/>
               </w:rPr>
               <w:tab/>
-            </w:r>
-            <w:r>
-              <w:rPr>
-                <w:noProof/>
-                <w:webHidden/>
-              </w:rPr>
               <w:fldChar w:fldCharType="begin"/>
-            </w:r>
-            <w:r>
-              <w:rPr>
-                <w:noProof/>
-                <w:webHidden/>
-              </w:rPr>
               <w:instrText xml:space="preserve"> PAGEREF _Toc240627310 \h </w:instrText>
-            </w:r>
-            <w:r>
-              <w:rPr>
-                <w:noProof/>
-                <w:webHidden/>
-              </w:rPr>
-            </w:r>
-            <w:r>
-              <w:rPr>
-                <w:noProof/>
-                <w:webHidden/>
-              </w:rPr>
               <w:fldChar w:fldCharType="separate"/>
-            </w:r>
-            <w:r>
-              <w:rPr>
-                <w:noProof/>
-                <w:webHidden/>
-              </w:rPr>
               <w:t>17</w:t>
-            </w:r>
-            <w:r>
-              <w:rPr>
-                <w:noProof/>
-                <w:webHidden/>
-              </w:rPr>
               <w:fldChar w:fldCharType="end"/>
             </w:r>
           </w:hyperlink>
@@ -2221,46 +1439,10 @@
                 <w:webHidden/>
               </w:rPr>
               <w:tab/>
-            </w:r>
-            <w:r>
-              <w:rPr>
-                <w:noProof/>
-                <w:webHidden/>
-              </w:rPr>
               <w:fldChar w:fldCharType="begin"/>
-            </w:r>
-            <w:r>
-              <w:rPr>
-                <w:noProof/>
-                <w:webHidden/>
-              </w:rPr>
               <w:instrText xml:space="preserve"> PAGEREF _Toc240627311 \h </w:instrText>
-            </w:r>
-            <w:r>
-              <w:rPr>
-                <w:noProof/>
-                <w:webHidden/>
-              </w:rPr>
-            </w:r>
-            <w:r>
-              <w:rPr>
-                <w:noProof/>
-                <w:webHidden/>
-              </w:rPr>
               <w:fldChar w:fldCharType="separate"/>
-            </w:r>
-            <w:r>
-              <w:rPr>
-                <w:noProof/>
-                <w:webHidden/>
-              </w:rPr>
               <w:t>19</w:t>
-            </w:r>
-            <w:r>
-              <w:rPr>
-                <w:noProof/>
-                <w:webHidden/>
-              </w:rPr>
               <w:fldChar w:fldCharType="end"/>
             </w:r>
           </w:hyperlink>
@@ -2295,46 +1477,10 @@
                 <w:webHidden/>
               </w:rPr>
               <w:tab/>
-            </w:r>
-            <w:r>
-              <w:rPr>
-                <w:noProof/>
-                <w:webHidden/>
-              </w:rPr>
               <w:fldChar w:fldCharType="begin"/>
-            </w:r>
-            <w:r>
-              <w:rPr>
-                <w:noProof/>
-                <w:webHidden/>
-              </w:rPr>
               <w:instrText xml:space="preserve"> PAGEREF _Toc240627312 \h </w:instrText>
-            </w:r>
-            <w:r>
-              <w:rPr>
-                <w:noProof/>
-                <w:webHidden/>
-              </w:rPr>
-            </w:r>
-            <w:r>
-              <w:rPr>
-                <w:noProof/>
-                <w:webHidden/>
-              </w:rPr>
               <w:fldChar w:fldCharType="separate"/>
-            </w:r>
-            <w:r>
-              <w:rPr>
-                <w:noProof/>
-                <w:webHidden/>
-              </w:rPr>
               <w:t>19</w:t>
-            </w:r>
-            <w:r>
-              <w:rPr>
-                <w:noProof/>
-                <w:webHidden/>
-              </w:rPr>
               <w:fldChar w:fldCharType="end"/>
             </w:r>
           </w:hyperlink>
@@ -2369,46 +1515,10 @@
                 <w:webHidden/>
               </w:rPr>
               <w:tab/>
-            </w:r>
-            <w:r>
-              <w:rPr>
-                <w:noProof/>
-                <w:webHidden/>
-              </w:rPr>
               <w:fldChar w:fldCharType="begin"/>
-            </w:r>
-            <w:r>
-              <w:rPr>
-                <w:noProof/>
-                <w:webHidden/>
-              </w:rPr>
               <w:instrText xml:space="preserve"> PAGEREF _Toc240627313 \h </w:instrText>
-            </w:r>
-            <w:r>
-              <w:rPr>
-                <w:noProof/>
-                <w:webHidden/>
-              </w:rPr>
-            </w:r>
-            <w:r>
-              <w:rPr>
-                <w:noProof/>
-                <w:webHidden/>
-              </w:rPr>
               <w:fldChar w:fldCharType="separate"/>
-            </w:r>
-            <w:r>
-              <w:rPr>
-                <w:noProof/>
-                <w:webHidden/>
-              </w:rPr>
               <w:t>19</w:t>
-            </w:r>
-            <w:r>
-              <w:rPr>
-                <w:noProof/>
-                <w:webHidden/>
-              </w:rPr>
               <w:fldChar w:fldCharType="end"/>
             </w:r>
           </w:hyperlink>
@@ -2949,25 +2059,7 @@
           <w:sz w:val="24"/>
           <w:szCs w:val="24"/>
         </w:rPr>
-        <w:t>2.2</w:t>
-      </w:r>
-      <w:r>
-        <w:rPr>
-          <w:rFonts w:ascii="Times New Roman" w:hAnsi="Times New Roman" w:cs="Times New Roman"/>
-          <w:color w:val="123F36"/>
-          <w:sz w:val="24"/>
-          <w:szCs w:val="24"/>
-        </w:rPr>
-        <w:t xml:space="preserve"> </w:t>
-      </w:r>
-      <w:r>
-        <w:rPr>
-          <w:rFonts w:ascii="Times New Roman" w:hAnsi="Times New Roman" w:cs="Times New Roman"/>
-          <w:color w:val="123F36"/>
-          <w:sz w:val="24"/>
-          <w:szCs w:val="24"/>
-        </w:rPr>
-        <w:t>Cerrar sesión</w:t>
+        <w:t xml:space="preserve">2.2 Cerrar sesión</w:t>
       </w:r>
       <w:bookmarkEnd w:id="3"/>
     </w:p>
@@ -2988,7 +2080,7 @@
           <w:sz w:val="24"/>
           <w:szCs w:val="24"/>
         </w:rPr>
-        <w:t>Para cerrar la sesión de forma segura, hacer clic en el ícono de salida ubicado en la parte inferior de la barra lateral izquierda, junto al nombre de usuario. El sistema redirige a la pantalla de inicio de sesión.</w:t>
+        <w:t>Para cerrar la sesión de forma segura, presionar el ícono de salida ubicado en la parte inferior de la barra lateral izquierda, junto al nombre de usuario; la pantalla vuelve directamente al inicio de sesión.</w:t>
       </w:r>
     </w:p>
     <w:p>
@@ -3010,25 +2102,7 @@
           <w:sz w:val="24"/>
           <w:szCs w:val="24"/>
         </w:rPr>
-        <w:t>3.</w:t>
-      </w:r>
-      <w:r>
-        <w:rPr>
-          <w:rFonts w:ascii="Times New Roman" w:hAnsi="Times New Roman" w:cs="Times New Roman"/>
-          <w:color w:val="123F36"/>
-          <w:sz w:val="24"/>
-          <w:szCs w:val="24"/>
-        </w:rPr>
-        <w:t xml:space="preserve"> </w:t>
-      </w:r>
-      <w:r>
-        <w:rPr>
-          <w:rFonts w:ascii="Times New Roman" w:hAnsi="Times New Roman" w:cs="Times New Roman"/>
-          <w:color w:val="123F36"/>
-          <w:sz w:val="24"/>
-          <w:szCs w:val="24"/>
-        </w:rPr>
-        <w:t>Panel de inicio</w:t>
+        <w:t xml:space="preserve">3. Panel de inicio</w:t>
       </w:r>
       <w:bookmarkEnd w:id="4"/>
     </w:p>
@@ -3104,6 +2178,19 @@
           </wp:inline>
         </w:drawing>
       </w:r>
+    </w:p>
+    <w:p>
+      <w:pPr>
+        <w:pStyle w:val="Ttulo2"/>
+        <w:spacing w:before="240" w:after="120"/>
+        <w:jc w:val="both"/>
+        <w:rPr>
+          <w:rFonts w:ascii="Times New Roman" w:hAnsi="Times New Roman" w:cs="Times New Roman"/>
+          <w:sz w:val="24"/>
+          <w:szCs w:val="24"/>
+        </w:rPr>
+      </w:pPr>
+      <w:bookmarkStart w:id="900" w:name="_Toc900000001"/>
       <w:r>
         <w:rPr>
           <w:rFonts w:ascii="Times New Roman" w:hAnsi="Times New Roman" w:cs="Times New Roman"/>
@@ -3111,17 +2198,9 @@
           <w:sz w:val="24"/>
           <w:szCs w:val="24"/>
         </w:rPr>
-        <w:t>3.1 Indicadores</w:t>
-      </w:r>
-      <w:r>
-        <w:rPr>
-          <w:rFonts w:ascii="Times New Roman" w:hAnsi="Times New Roman" w:cs="Times New Roman"/>
-          <w:color w:val="123F36"/>
-          <w:sz w:val="24"/>
-          <w:szCs w:val="24"/>
-        </w:rPr>
-        <w:t xml:space="preserve"> principales</w:t>
-      </w:r>
+        <w:t xml:space="preserve">3.1 Indicadores principales</w:t>
+      </w:r>
+      <w:bookmarkEnd w:id="900"/>
     </w:p>
     <w:p>
       <w:pPr>
@@ -3458,25 +2537,7 @@
           <w:sz w:val="24"/>
           <w:szCs w:val="24"/>
         </w:rPr>
-        <w:t>3.2</w:t>
-      </w:r>
-      <w:r>
-        <w:rPr>
-          <w:rFonts w:ascii="Times New Roman" w:hAnsi="Times New Roman" w:cs="Times New Roman"/>
-          <w:color w:val="123F36"/>
-          <w:sz w:val="24"/>
-          <w:szCs w:val="24"/>
-        </w:rPr>
-        <w:t xml:space="preserve"> </w:t>
-      </w:r>
-      <w:r>
-        <w:rPr>
-          <w:rFonts w:ascii="Times New Roman" w:hAnsi="Times New Roman" w:cs="Times New Roman"/>
-          <w:color w:val="123F36"/>
-          <w:sz w:val="24"/>
-          <w:szCs w:val="24"/>
-        </w:rPr>
-        <w:t>Accesos rápidos</w:t>
+        <w:t xml:space="preserve">3.2 Accesos rápidos</w:t>
       </w:r>
       <w:bookmarkEnd w:id="5"/>
     </w:p>
@@ -3619,25 +2680,7 @@
           <w:sz w:val="24"/>
           <w:szCs w:val="24"/>
         </w:rPr>
-        <w:t>3.3</w:t>
-      </w:r>
-      <w:r>
-        <w:rPr>
-          <w:rFonts w:ascii="Times New Roman" w:hAnsi="Times New Roman" w:cs="Times New Roman"/>
-          <w:color w:val="123F36"/>
-          <w:sz w:val="24"/>
-          <w:szCs w:val="24"/>
-        </w:rPr>
-        <w:t xml:space="preserve"> </w:t>
-      </w:r>
-      <w:r>
-        <w:rPr>
-          <w:rFonts w:ascii="Times New Roman" w:hAnsi="Times New Roman" w:cs="Times New Roman"/>
-          <w:color w:val="123F36"/>
-          <w:sz w:val="24"/>
-          <w:szCs w:val="24"/>
-        </w:rPr>
-        <w:t>Navegación lateral</w:t>
+        <w:t xml:space="preserve">3.3 Navegación lateral</w:t>
       </w:r>
       <w:bookmarkEnd w:id="6"/>
     </w:p>
@@ -4073,25 +3116,7 @@
           <w:sz w:val="24"/>
           <w:szCs w:val="24"/>
         </w:rPr>
-        <w:t>4.</w:t>
-      </w:r>
-      <w:r>
-        <w:rPr>
-          <w:rFonts w:ascii="Times New Roman" w:hAnsi="Times New Roman" w:cs="Times New Roman"/>
-          <w:color w:val="123F36"/>
-          <w:sz w:val="24"/>
-          <w:szCs w:val="24"/>
-        </w:rPr>
-        <w:t xml:space="preserve"> </w:t>
-      </w:r>
-      <w:r>
-        <w:rPr>
-          <w:rFonts w:ascii="Times New Roman" w:hAnsi="Times New Roman" w:cs="Times New Roman"/>
-          <w:color w:val="123F36"/>
-          <w:sz w:val="24"/>
-          <w:szCs w:val="24"/>
-        </w:rPr>
-        <w:t>Tipos de usuario y permisos</w:t>
+        <w:t xml:space="preserve">4. Tipos de usuario y permisos</w:t>
       </w:r>
       <w:bookmarkEnd w:id="7"/>
     </w:p>
@@ -4134,25 +3159,7 @@
           <w:sz w:val="24"/>
           <w:szCs w:val="24"/>
         </w:rPr>
-        <w:t>4.1</w:t>
-      </w:r>
-      <w:r>
-        <w:rPr>
-          <w:rFonts w:ascii="Times New Roman" w:hAnsi="Times New Roman" w:cs="Times New Roman"/>
-          <w:color w:val="123F36"/>
-          <w:sz w:val="24"/>
-          <w:szCs w:val="24"/>
-        </w:rPr>
-        <w:t xml:space="preserve"> </w:t>
-      </w:r>
-      <w:r>
-        <w:rPr>
-          <w:rFonts w:ascii="Times New Roman" w:hAnsi="Times New Roman" w:cs="Times New Roman"/>
-          <w:color w:val="123F36"/>
-          <w:sz w:val="24"/>
-          <w:szCs w:val="24"/>
-        </w:rPr>
-        <w:t>Administrador</w:t>
+        <w:t xml:space="preserve">4.1 Administrador</w:t>
       </w:r>
       <w:bookmarkEnd w:id="8"/>
     </w:p>
@@ -4262,7 +3269,6 @@
                 <w:szCs w:val="24"/>
               </w:rPr>
             </w:pPr>
-            <w:proofErr w:type="spellStart"/>
             <w:r>
               <w:rPr>
                 <w:rFonts w:ascii="Times New Roman" w:hAnsi="Times New Roman" w:cs="Times New Roman"/>
@@ -4272,7 +3278,6 @@
               </w:rPr>
               <w:t>puede_gestionar_usuarios</w:t>
             </w:r>
-            <w:proofErr w:type="spellEnd"/>
           </w:p>
         </w:tc>
         <w:tc>
@@ -4318,7 +3323,6 @@
                 <w:szCs w:val="24"/>
               </w:rPr>
             </w:pPr>
-            <w:proofErr w:type="spellStart"/>
             <w:r>
               <w:rPr>
                 <w:rFonts w:ascii="Times New Roman" w:hAnsi="Times New Roman" w:cs="Times New Roman"/>
@@ -4329,7 +3333,6 @@
               <w:lastRenderedPageBreak/>
               <w:t>puede_configurar_planes</w:t>
             </w:r>
-            <w:proofErr w:type="spellEnd"/>
           </w:p>
         </w:tc>
         <w:tc>
@@ -4408,25 +3411,7 @@
           <w:sz w:val="24"/>
           <w:szCs w:val="24"/>
         </w:rPr>
-        <w:t>4.2</w:t>
-      </w:r>
-      <w:r>
-        <w:rPr>
-          <w:rFonts w:ascii="Times New Roman" w:hAnsi="Times New Roman" w:cs="Times New Roman"/>
-          <w:color w:val="123F36"/>
-          <w:sz w:val="24"/>
-          <w:szCs w:val="24"/>
-        </w:rPr>
-        <w:t xml:space="preserve"> </w:t>
-      </w:r>
-      <w:r>
-        <w:rPr>
-          <w:rFonts w:ascii="Times New Roman" w:hAnsi="Times New Roman" w:cs="Times New Roman"/>
-          <w:color w:val="123F36"/>
-          <w:sz w:val="24"/>
-          <w:szCs w:val="24"/>
-        </w:rPr>
-        <w:t>Empleados por área</w:t>
+        <w:t xml:space="preserve">4.2 Empleados por área</w:t>
       </w:r>
       <w:bookmarkEnd w:id="9"/>
     </w:p>
@@ -5124,17 +4109,7 @@
           <w:sz w:val="24"/>
           <w:szCs w:val="24"/>
         </w:rPr>
-        <w:t xml:space="preserve"> Ningún</w:t>
-      </w:r>
-      <w:r>
-        <w:rPr>
-          <w:rFonts w:ascii="Times New Roman" w:hAnsi="Times New Roman" w:cs="Times New Roman"/>
-          <w:b/>
-          <w:color w:val="B54500"/>
-          <w:sz w:val="24"/>
-          <w:szCs w:val="24"/>
-        </w:rPr>
-        <w:t xml:space="preserve"> empleado, independientemente de su área, puede acceder a la gestión de usuarios. Esa sección es exclusiva del Administrador con el permiso correspondiente.</w:t>
+        <w:t xml:space="preserve"> Ningún empleado, independientemente de su área, puede acceder a la gestión de usuarios. Esa sección es exclusiva del Administrador con el permiso correspondiente.</w:t>
       </w:r>
     </w:p>
     <w:p>
@@ -5156,25 +4131,7 @@
           <w:sz w:val="24"/>
           <w:szCs w:val="24"/>
         </w:rPr>
-        <w:t>4.3</w:t>
-      </w:r>
-      <w:r>
-        <w:rPr>
-          <w:rFonts w:ascii="Times New Roman" w:hAnsi="Times New Roman" w:cs="Times New Roman"/>
-          <w:color w:val="123F36"/>
-          <w:sz w:val="24"/>
-          <w:szCs w:val="24"/>
-        </w:rPr>
-        <w:t xml:space="preserve"> </w:t>
-      </w:r>
-      <w:r>
-        <w:rPr>
-          <w:rFonts w:ascii="Times New Roman" w:hAnsi="Times New Roman" w:cs="Times New Roman"/>
-          <w:color w:val="123F36"/>
-          <w:sz w:val="24"/>
-          <w:szCs w:val="24"/>
-        </w:rPr>
-        <w:t>Tabla de acceso al módulo Clientes</w:t>
+        <w:t xml:space="preserve">4.3 Tabla de acceso al módulo Clientes</w:t>
       </w:r>
       <w:bookmarkEnd w:id="10"/>
     </w:p>
@@ -6142,25 +5099,7 @@
           <w:szCs w:val="24"/>
         </w:rPr>
         <w:lastRenderedPageBreak/>
-        <w:t>5.</w:t>
-      </w:r>
-      <w:r>
-        <w:rPr>
-          <w:rFonts w:ascii="Times New Roman" w:hAnsi="Times New Roman" w:cs="Times New Roman"/>
-          <w:color w:val="123F36"/>
-          <w:sz w:val="24"/>
-          <w:szCs w:val="24"/>
-        </w:rPr>
-        <w:t xml:space="preserve"> </w:t>
-      </w:r>
-      <w:r>
-        <w:rPr>
-          <w:rFonts w:ascii="Times New Roman" w:hAnsi="Times New Roman" w:cs="Times New Roman"/>
-          <w:color w:val="123F36"/>
-          <w:sz w:val="24"/>
-          <w:szCs w:val="24"/>
-        </w:rPr>
-        <w:t>Módulo 1 – Gestión de Clientes</w:t>
+        <w:t xml:space="preserve">5. Módulo 1 – Gestión de Clientes</w:t>
       </w:r>
       <w:bookmarkEnd w:id="11"/>
     </w:p>
@@ -6203,16 +5142,7 @@
           <w:sz w:val="24"/>
           <w:szCs w:val="24"/>
         </w:rPr>
-        <w:t>5.1 Consultar</w:t>
-      </w:r>
-      <w:r>
-        <w:rPr>
-          <w:rFonts w:ascii="Times New Roman" w:hAnsi="Times New Roman" w:cs="Times New Roman"/>
-          <w:color w:val="123F36"/>
-          <w:sz w:val="24"/>
-          <w:szCs w:val="24"/>
-        </w:rPr>
-        <w:t xml:space="preserve"> y buscar clientes</w:t>
+        <w:t xml:space="preserve">5.1 Consultar y buscar clientes</w:t>
       </w:r>
       <w:bookmarkEnd w:id="12"/>
     </w:p>
@@ -6233,7 +5163,7 @@
           <w:sz w:val="24"/>
           <w:szCs w:val="24"/>
         </w:rPr>
-        <w:t>Para acceder al listado de clientes, hacer clic en la opción Clientes de la barra lateral. El sistema muestra todos los clientes ordenados alfabéticamente.</w:t>
+        <w:t>Para acceder al listado de clientes, seleccionar la opción Clientes de la barra lateral. Se despliegan todos los clientes ordenados alfabéticamente.</w:t>
       </w:r>
     </w:p>
     <w:p>
@@ -6834,7 +5764,7 @@
           <w:sz w:val="24"/>
           <w:szCs w:val="24"/>
         </w:rPr>
-        <w:t>Escribir el texto en el campo y hacer clic en Buscar. Para ver todos los clientes nuevamente, borrar el campo y volver a hacer clic en Buscar.</w:t>
+        <w:t>Escribir el texto en el campo y presionar Buscar. Para volver a ver todos los clientes, basta borrar el campo y pulsar Buscar otra vez.</w:t>
       </w:r>
     </w:p>
     <w:p>
@@ -6877,16 +5807,7 @@
           <w:sz w:val="24"/>
           <w:szCs w:val="24"/>
         </w:rPr>
-        <w:t>5.2 Ver</w:t>
-      </w:r>
-      <w:r>
-        <w:rPr>
-          <w:rFonts w:ascii="Times New Roman" w:hAnsi="Times New Roman" w:cs="Times New Roman"/>
-          <w:color w:val="123F36"/>
-          <w:sz w:val="24"/>
-          <w:szCs w:val="24"/>
-        </w:rPr>
-        <w:t xml:space="preserve"> la ficha de un cliente</w:t>
+        <w:t xml:space="preserve">5.2 Ver la ficha de un cliente</w:t>
       </w:r>
       <w:bookmarkEnd w:id="13"/>
     </w:p>
@@ -6907,7 +5828,7 @@
           <w:sz w:val="24"/>
           <w:szCs w:val="24"/>
         </w:rPr>
-        <w:t>Desde el listado, hacer clic en Ver ficha → en la fila del cliente que se desea consultar. El sistema abre la ficha completa.</w:t>
+        <w:t>Desde el listado, pulsar Ver ficha → en la fila del cliente que se desea consultar, y se abre la ficha completa.</w:t>
       </w:r>
     </w:p>
     <w:p>
@@ -7432,29 +6353,7 @@
           <w:sz w:val="24"/>
           <w:szCs w:val="24"/>
         </w:rPr>
-        <w:t xml:space="preserve">Nota: Los usuarios de Soporte y Atención al cliente pueden ver la </w:t>
-      </w:r>
-      <w:proofErr w:type="gramStart"/>
-      <w:r>
-        <w:rPr>
-          <w:rFonts w:ascii="Times New Roman" w:hAnsi="Times New Roman" w:cs="Times New Roman"/>
-          <w:i/>
-          <w:color w:val="1A6B8A"/>
-          <w:sz w:val="24"/>
-          <w:szCs w:val="24"/>
-        </w:rPr>
-        <w:t>ficha</w:t>
-      </w:r>
-      <w:proofErr w:type="gramEnd"/>
-      <w:r>
-        <w:rPr>
-          <w:rFonts w:ascii="Times New Roman" w:hAnsi="Times New Roman" w:cs="Times New Roman"/>
-          <w:i/>
-          <w:color w:val="1A6B8A"/>
-          <w:sz w:val="24"/>
-          <w:szCs w:val="24"/>
-        </w:rPr>
-        <w:t xml:space="preserve"> pero no verán los botones Editar ni Dar de baja.</w:t>
+        <w:t xml:space="preserve">Nota: Los usuarios de Soporte y Atención al cliente pueden ver la ficha pero no verán los botones Editar ni Dar de baja.</w:t>
       </w:r>
     </w:p>
     <w:p>
@@ -7476,16 +6375,7 @@
           <w:sz w:val="24"/>
           <w:szCs w:val="24"/>
         </w:rPr>
-        <w:t>5.3 Registrar</w:t>
-      </w:r>
-      <w:r>
-        <w:rPr>
-          <w:rFonts w:ascii="Times New Roman" w:hAnsi="Times New Roman" w:cs="Times New Roman"/>
-          <w:color w:val="123F36"/>
-          <w:sz w:val="24"/>
-          <w:szCs w:val="24"/>
-        </w:rPr>
-        <w:t xml:space="preserve"> un nuevo cliente</w:t>
+        <w:t xml:space="preserve">5.3 Registrar un nuevo cliente</w:t>
       </w:r>
       <w:bookmarkEnd w:id="14"/>
     </w:p>
@@ -7527,7 +6417,7 @@
           <w:szCs w:val="24"/>
         </w:rPr>
         <w:lastRenderedPageBreak/>
-        <w:t>Para registrar un cliente, hacer clic en el botón + Nuevo cliente en la esquina superior derecha del listado, o en Registrar cliente desde los accesos rápidos del panel de inicio.</w:t>
+        <w:t>Para registrar un cliente, presionar el botón + Nuevo cliente en la esquina superior derecha del listado, o bien Registrar cliente desde los accesos rápidos del panel de inicio.</w:t>
       </w:r>
     </w:p>
     <w:p>
@@ -8347,7 +7237,7 @@
           <w:sz w:val="24"/>
           <w:szCs w:val="24"/>
         </w:rPr>
-        <w:t>Una vez completados los datos obligatorios, hacer clic en Guardar. El sistema registra al cliente y redirige automáticamente a su ficha, mostrando el mensaje «Cliente registrado correctamente».</w:t>
+        <w:t>Una vez completados los datos obligatorios, presionar Guardar: el cliente queda registrado y la pantalla pasa directamente a su ficha, con el mensaje «Cliente registrado correctamente».</w:t>
       </w:r>
     </w:p>
     <w:p>
@@ -8423,17 +7313,7 @@
           <w:sz w:val="24"/>
           <w:szCs w:val="24"/>
         </w:rPr>
-        <w:t xml:space="preserve"> Si</w:t>
-      </w:r>
-      <w:r>
-        <w:rPr>
-          <w:rFonts w:ascii="Times New Roman" w:hAnsi="Times New Roman" w:cs="Times New Roman"/>
-          <w:b/>
-          <w:color w:val="B54500"/>
-          <w:sz w:val="24"/>
-          <w:szCs w:val="24"/>
-        </w:rPr>
-        <w:t xml:space="preserve"> ya existe un cliente con el mismo tipo y número de documento, el sistema rechazará el registro y mostrará un mensaje de error indicando el campo a corregir.</w:t>
+        <w:t xml:space="preserve"> Si ya existe un cliente con el mismo tipo y número de documento, el sistema rechazará el registro y mostrará un mensaje de error indicando el campo a corregir.</w:t>
       </w:r>
     </w:p>
     <w:p>
@@ -8453,7 +7333,7 @@
           <w:sz w:val="24"/>
           <w:szCs w:val="24"/>
         </w:rPr>
-        <w:t>Para cancelar sin guardar, hacer clic en Cancelar. El sistema regresa al listado de clientes.</w:t>
+        <w:t>Para cancelar sin guardar, pulsar Cancelar y se vuelve al listado de clientes.</w:t>
       </w:r>
     </w:p>
     <w:p>
@@ -8475,16 +7355,7 @@
           <w:sz w:val="24"/>
           <w:szCs w:val="24"/>
         </w:rPr>
-        <w:t>5.4 Editar</w:t>
-      </w:r>
-      <w:r>
-        <w:rPr>
-          <w:rFonts w:ascii="Times New Roman" w:hAnsi="Times New Roman" w:cs="Times New Roman"/>
-          <w:color w:val="123F36"/>
-          <w:sz w:val="24"/>
-          <w:szCs w:val="24"/>
-        </w:rPr>
-        <w:t xml:space="preserve"> los datos de un cliente</w:t>
+        <w:t xml:space="preserve">5.4 Editar los datos de un cliente</w:t>
       </w:r>
       <w:bookmarkEnd w:id="15"/>
     </w:p>
@@ -8525,7 +7396,7 @@
           <w:sz w:val="24"/>
           <w:szCs w:val="24"/>
         </w:rPr>
-        <w:t>Desde la ficha del cliente, hacer clic en Editar. El sistema abre el formulario de edición con todos los datos actuales precargados.</w:t>
+        <w:t>Desde la ficha del cliente, seleccionar Editar para abrir el formulario de edición con todos los datos actuales precargados.</w:t>
       </w:r>
     </w:p>
     <w:p>
@@ -8745,7 +7616,7 @@
           <w:sz w:val="24"/>
           <w:szCs w:val="24"/>
         </w:rPr>
-        <w:t>Modificar los campos necesarios y hacer clic en Guardar. El sistema actualiza los datos y redirige a la ficha con el mensaje «Cliente actualizado correctamente».</w:t>
+        <w:t>Modificar los campos necesarios y presionar Guardar. Los datos quedan actualizados y la pantalla vuelve a la ficha con el mensaje «Cliente actualizado correctamente».</w:t>
       </w:r>
     </w:p>
     <w:p>
@@ -8767,16 +7638,7 @@
           <w:sz w:val="24"/>
           <w:szCs w:val="24"/>
         </w:rPr>
-        <w:t>5.5 Dar</w:t>
-      </w:r>
-      <w:r>
-        <w:rPr>
-          <w:rFonts w:ascii="Times New Roman" w:hAnsi="Times New Roman" w:cs="Times New Roman"/>
-          <w:color w:val="123F36"/>
-          <w:sz w:val="24"/>
-          <w:szCs w:val="24"/>
-        </w:rPr>
-        <w:t xml:space="preserve"> de baja a un cliente</w:t>
+        <w:t xml:space="preserve">5.5 Dar de baja a un cliente</w:t>
       </w:r>
       <w:bookmarkEnd w:id="16"/>
     </w:p>
@@ -8837,7 +7699,7 @@
           <w:sz w:val="24"/>
           <w:szCs w:val="24"/>
         </w:rPr>
-        <w:t>Desde la ficha del cliente, desplazarse al final de la página y hacer clic en el botón Dar de baja (en color rojo). El sistema mostrará un cuadro de confirmación.</w:t>
+        <w:t>Desde la ficha del cliente, desplazarse al final de la página y pulsar el botón Dar de baja (en color rojo); aparece un cuadro de confirmación.</w:t>
       </w:r>
     </w:p>
     <w:p>
@@ -8903,7 +7765,7 @@
           <w:sz w:val="24"/>
           <w:szCs w:val="24"/>
         </w:rPr>
-        <w:t>Hacer clic en Aceptar para confirmar, o en Cancelar para volver sin cambios. Al confirmar, el sistema:</w:t>
+        <w:t>Presionar Aceptar para confirmar, o Cancelar para volver sin cambios. Al confirmar, el sistema:</w:t>
       </w:r>
     </w:p>
     <w:p>
@@ -9092,61 +7954,7 @@
           <w:sz w:val="24"/>
           <w:szCs w:val="24"/>
         </w:rPr>
-        <w:t xml:space="preserve"> Este</w:t>
-      </w:r>
-      <w:r>
-        <w:rPr>
-          <w:rFonts w:ascii="Times New Roman" w:hAnsi="Times New Roman" w:cs="Times New Roman"/>
-          <w:b/>
-          <w:color w:val="B54500"/>
-          <w:sz w:val="24"/>
-          <w:szCs w:val="24"/>
-        </w:rPr>
-        <w:t xml:space="preserve"> módulo es de acceso restringido. Solo pueden verlo y operarlo los Administradores que tengan habilitado el permiso </w:t>
-      </w:r>
-      <w:proofErr w:type="spellStart"/>
-      <w:r>
-        <w:rPr>
-          <w:rFonts w:ascii="Times New Roman" w:hAnsi="Times New Roman" w:cs="Times New Roman"/>
-          <w:b/>
-          <w:color w:val="B54500"/>
-          <w:sz w:val="24"/>
-          <w:szCs w:val="24"/>
-        </w:rPr>
-        <w:t>puede_gestionar_usuarios</w:t>
-      </w:r>
-      <w:proofErr w:type="spellEnd"/>
-      <w:r>
-        <w:rPr>
-          <w:rFonts w:ascii="Times New Roman" w:hAnsi="Times New Roman" w:cs="Times New Roman"/>
-          <w:b/>
-          <w:color w:val="B54500"/>
-          <w:sz w:val="24"/>
-          <w:szCs w:val="24"/>
-        </w:rPr>
-        <w:t xml:space="preserve">. Los usuarios de tipo Empleado no tienen acceso a esta sección </w:t>
-      </w:r>
-      <w:proofErr w:type="gramStart"/>
-      <w:r>
-        <w:rPr>
-          <w:rFonts w:ascii="Times New Roman" w:hAnsi="Times New Roman" w:cs="Times New Roman"/>
-          <w:b/>
-          <w:color w:val="B54500"/>
-          <w:sz w:val="24"/>
-          <w:szCs w:val="24"/>
-        </w:rPr>
-        <w:t>bajo ninguna circunstancia</w:t>
-      </w:r>
-      <w:proofErr w:type="gramEnd"/>
-      <w:r>
-        <w:rPr>
-          <w:rFonts w:ascii="Times New Roman" w:hAnsi="Times New Roman" w:cs="Times New Roman"/>
-          <w:b/>
-          <w:color w:val="B54500"/>
-          <w:sz w:val="24"/>
-          <w:szCs w:val="24"/>
-        </w:rPr>
-        <w:t>.</w:t>
+        <w:t xml:space="preserve"> Este módulo es de acceso restringido. Solo pueden verlo y operarlo los Administradores que tengan habilitado el permiso puede_gestionar_usuarios. Los usuarios de tipo Empleado no tienen acceso a esta sección bajo ninguna circunstancia.</w:t>
       </w:r>
     </w:p>
     <w:p>
@@ -9168,16 +7976,7 @@
           <w:sz w:val="24"/>
           <w:szCs w:val="24"/>
         </w:rPr>
-        <w:t>6.1 Ver</w:t>
-      </w:r>
-      <w:r>
-        <w:rPr>
-          <w:rFonts w:ascii="Times New Roman" w:hAnsi="Times New Roman" w:cs="Times New Roman"/>
-          <w:color w:val="123F36"/>
-          <w:sz w:val="24"/>
-          <w:szCs w:val="24"/>
-        </w:rPr>
-        <w:t xml:space="preserve"> el listado de usuarios</w:t>
+        <w:t xml:space="preserve">6.1 Ver el listado de usuarios</w:t>
       </w:r>
       <w:bookmarkEnd w:id="18"/>
     </w:p>
@@ -9198,7 +7997,7 @@
           <w:sz w:val="24"/>
           <w:szCs w:val="24"/>
         </w:rPr>
-        <w:t>Hacer clic en la sección Usuarios del menú lateral. El sistema muestra la página Usuarios y permisos, que contiene en la parte superior un formulario de creación y debajo la tabla con todos los usuarios del sistema.</w:t>
+        <w:t>Seleccionar la sección Usuarios del menú lateral para abrir la página Usuarios y permisos, que contiene en la parte superior un formulario de creación y debajo la tabla con todos los usuarios del sistema.</w:t>
       </w:r>
     </w:p>
     <w:p>
@@ -9492,27 +8291,7 @@
                 <w:sz w:val="24"/>
                 <w:szCs w:val="24"/>
               </w:rPr>
-              <w:t xml:space="preserve">Para empleados: el área asignada (administración, soporte, </w:t>
-            </w:r>
-            <w:proofErr w:type="spellStart"/>
-            <w:r>
-              <w:rPr>
-                <w:rFonts w:ascii="Times New Roman" w:hAnsi="Times New Roman" w:cs="Times New Roman"/>
-                <w:color w:val="444444"/>
-                <w:sz w:val="24"/>
-                <w:szCs w:val="24"/>
-              </w:rPr>
-              <w:t>atencion_cliente</w:t>
-            </w:r>
-            <w:proofErr w:type="spellEnd"/>
-            <w:r>
-              <w:rPr>
-                <w:rFonts w:ascii="Times New Roman" w:hAnsi="Times New Roman" w:cs="Times New Roman"/>
-                <w:color w:val="444444"/>
-                <w:sz w:val="24"/>
-                <w:szCs w:val="24"/>
-              </w:rPr>
-              <w:t>). Para administradores: el nivel de acceso (total).</w:t>
+              <w:t xml:space="preserve">Para empleados: el área asignada (administración, soporte, atencion_cliente). Para administradores: el nivel de acceso (total).</w:t>
             </w:r>
           </w:p>
         </w:tc>
@@ -9601,16 +8380,7 @@
           <w:szCs w:val="24"/>
         </w:rPr>
         <w:lastRenderedPageBreak/>
-        <w:t>6.2 Crear</w:t>
-      </w:r>
-      <w:r>
-        <w:rPr>
-          <w:rFonts w:ascii="Times New Roman" w:hAnsi="Times New Roman" w:cs="Times New Roman"/>
-          <w:color w:val="123F36"/>
-          <w:sz w:val="24"/>
-          <w:szCs w:val="24"/>
-        </w:rPr>
-        <w:t xml:space="preserve"> un nuevo usuario empleado</w:t>
+        <w:t xml:space="preserve">6.2 Crear un nuevo usuario empleado</w:t>
       </w:r>
       <w:bookmarkEnd w:id="19"/>
     </w:p>
@@ -10273,7 +9043,7 @@
           <w:sz w:val="24"/>
           <w:szCs w:val="24"/>
         </w:rPr>
-        <w:t>Hacer clic en Crear usuario. El sistema registra el usuario, muestra el mensaje de confirmación y agrega la nueva fila a la tabla.</w:t>
+        <w:t>Presionar Crear usuario: queda registrado, aparece el mensaje de confirmación y se agrega la nueva fila a la tabla.</w:t>
       </w:r>
     </w:p>
     <w:p>
@@ -10317,16 +9087,7 @@
           <w:szCs w:val="24"/>
         </w:rPr>
         <w:lastRenderedPageBreak/>
-        <w:t>6.3 Crear</w:t>
-      </w:r>
-      <w:r>
-        <w:rPr>
-          <w:rFonts w:ascii="Times New Roman" w:hAnsi="Times New Roman" w:cs="Times New Roman"/>
-          <w:color w:val="123F36"/>
-          <w:sz w:val="24"/>
-          <w:szCs w:val="24"/>
-        </w:rPr>
-        <w:t xml:space="preserve"> un nuevo usuario administrador</w:t>
+        <w:t xml:space="preserve">6.3 Crear un nuevo usuario administrador</w:t>
       </w:r>
       <w:bookmarkEnd w:id="20"/>
     </w:p>
@@ -10832,7 +9593,7 @@
           <w:sz w:val="24"/>
           <w:szCs w:val="24"/>
         </w:rPr>
-        <w:t>Al crear un administrador, el sistema asigna por defecto nivel de acceso total y habilita los dos permisos adicionales (gestionar usuarios y configurar planes). Hacer clic en Crear usuario para confirmar.</w:t>
+        <w:t>Al crear un administrador, se asigna por defecto nivel de acceso total y se habilitan los dos permisos adicionales (gestionar usuarios y configurar planes). Presionar Crear usuario para confirmar.</w:t>
       </w:r>
     </w:p>
     <w:p>
@@ -10854,16 +9615,7 @@
           <w:sz w:val="24"/>
           <w:szCs w:val="24"/>
         </w:rPr>
-        <w:t>6.4 Desactivar</w:t>
-      </w:r>
-      <w:r>
-        <w:rPr>
-          <w:rFonts w:ascii="Times New Roman" w:hAnsi="Times New Roman" w:cs="Times New Roman"/>
-          <w:color w:val="123F36"/>
-          <w:sz w:val="24"/>
-          <w:szCs w:val="24"/>
-        </w:rPr>
-        <w:t xml:space="preserve"> un usuario</w:t>
+        <w:t xml:space="preserve">6.4 Desactivar un usuario</w:t>
       </w:r>
       <w:bookmarkEnd w:id="21"/>
     </w:p>
@@ -10904,7 +9656,7 @@
           <w:sz w:val="24"/>
           <w:szCs w:val="24"/>
         </w:rPr>
-        <w:t>En la tabla de usuarios, ubicar la fila del usuario a desactivar y hacer clic en Desactivar (texto en color rojo al final de la fila). El sistema mostrará un cuadro de confirmación: «¿Desactivar este usuario?»</w:t>
+        <w:t>En la tabla de usuarios, ubicar la fila del usuario a desactivar y pulsar Desactivar (texto en color rojo al final de la fila); aparece un cuadro de confirmación: «¿Desactivar este usuario?»</w:t>
       </w:r>
     </w:p>
     <w:p>
@@ -10990,7 +9742,7 @@
           <w:sz w:val="24"/>
           <w:szCs w:val="24"/>
         </w:rPr>
-        <w:t>Hacer clic en Aceptar para confirmar. El estado del usuario cambiará a Inactivo en la tabla.</w:t>
+        <w:t>Presionar Aceptar para confirmar y el estado del usuario pasará a Inactivo en la tabla.</w:t>
       </w:r>
     </w:p>
     <w:p>
@@ -11079,17 +9831,7 @@
           <w:sz w:val="24"/>
           <w:szCs w:val="24"/>
         </w:rPr>
-        <w:t xml:space="preserve"> Un</w:t>
-      </w:r>
-      <w:r>
-        <w:rPr>
-          <w:rFonts w:ascii="Times New Roman" w:hAnsi="Times New Roman" w:cs="Times New Roman"/>
-          <w:b/>
-          <w:color w:val="B54500"/>
-          <w:sz w:val="24"/>
-          <w:szCs w:val="24"/>
-        </w:rPr>
-        <w:t xml:space="preserve"> administrador no puede desactivar su propia cuenta. El botón Desactivar no aparece en la fila del usuario que tiene la sesión activa en ese momento. Si se intenta forzar esta acción, el sistema devuelve un error.</w:t>
+        <w:t xml:space="preserve"> Un administrador no puede desactivar su propia cuenta. El botón Desactivar no aparece en la fila del usuario que tiene la sesión activa en ese momento. Si se intenta forzar esta acción, el sistema devuelve un error.</w:t>
       </w:r>
     </w:p>
     <w:p>

</xml_diff>